<commit_message>
Organize app_publishing_pack into master publishing_guide.docx and update QuitMate graphics assets
</commit_message>
<xml_diff>
--- a/tobacco_awareness/app_publishing_pack/publishing_guide.docx
+++ b/tobacco_awareness/app_publishing_pack/publishing_guide.docx
@@ -8,176 +8,851 @@
       </w:pPr>
       <w:r>
         <w:rPr>
-          <w:rFonts w:ascii="Calibri" w:hAnsi="Calibri"/>
           <w:b/>
-          <w:i w:val="0"/>
-          <w:color w:val="2E7D32"/>
-          <w:sz w:val="32"/>
+          <w:color w:val="0F5132"/>
+          <w:sz w:val="48"/>
         </w:rPr>
-        <w:t>তামাকমুক্ত জীবন (Tamakmukto Jibon) - গুগল প্লে স্টোর পাবলিশিং গাইড</w:t>
-      </w:r>
-    </w:p>
-    <w:p>
-      <w:r>
-        <w:t>--------------------------------------------------</w:t>
-      </w:r>
-    </w:p>
-    <w:p>
-      <w:r>
-        <w:rPr>
-          <w:rFonts w:ascii="Calibri" w:hAnsi="Calibri"/>
-          <w:b/>
-          <w:i w:val="0"/>
-          <w:color w:val="2E7D32"/>
-          <w:sz w:val="26"/>
-        </w:rPr>
-        <w:t>১. ফোল্ডার স্ট্রাকচার ও প্রয়োজনীয় এসেট সমূহ</w:t>
-      </w:r>
-    </w:p>
-    <w:p>
-      <w:r>
-        <w:rPr>
-          <w:b/>
-        </w:rPr>
-        <w:t xml:space="preserve">• assets/app_icon.png: </w:t>
-      </w:r>
-      <w:r>
-        <w:t>প্লে স্টোরের জন্য ৫১২x৫১২ সাইজের লোগো।</w:t>
-        <w:br/>
-      </w:r>
-      <w:r>
-        <w:rPr>
-          <w:b/>
-        </w:rPr>
-        <w:t xml:space="preserve">• assets/feature_graphic.png: </w:t>
-      </w:r>
-      <w:r>
-        <w:t>প্লে স্টোরের জন্য ১০২৪x৫০০ সাইজের ব্যানার ইমেজ।</w:t>
-        <w:br/>
-      </w:r>
-      <w:r>
-        <w:rPr>
-          <w:b/>
-        </w:rPr>
-        <w:t xml:space="preserve">• metadata/play_store_metadata.docx: </w:t>
-      </w:r>
-      <w:r>
-        <w:t>প্লে স্টোরে দেওয়ার মত টাইটেল ও ডেসক্রিপশন সমূহ।</w:t>
-        <w:br/>
-      </w:r>
-      <w:r>
-        <w:rPr>
-          <w:b/>
-        </w:rPr>
-        <w:t xml:space="preserve">• assets/screenshots/: </w:t>
-      </w:r>
-      <w:r>
-        <w:t>আপনার ফোন থেকে নেওয়া অ্যাপের স্ক্রিনশট রাখার ফোল্ডার।</w:t>
-      </w:r>
-    </w:p>
-    <w:p>
-      <w:r>
-        <w:rPr>
-          <w:rFonts w:ascii="Calibri" w:hAnsi="Calibri"/>
-          <w:b/>
-          <w:i w:val="0"/>
-          <w:color w:val="2E7D32"/>
-          <w:sz w:val="26"/>
-        </w:rPr>
-        <w:t>২. অ্যান্ড্রয়েড রিলিজ বান্ডেল তৈরি করার কমান্ড (AAB format)</w:t>
-      </w:r>
-    </w:p>
-    <w:p>
-      <w:r>
-        <w:t>আপনার প্রোজেক্ট ডিরেক্টরিতে টার্মিনাল ওপেন করে নিচের কমান্ডটি রান করুন:</w:t>
+        <w:t>QuitMate - Google Play Store Publishing Master Guide</w:t>
       </w:r>
     </w:p>
     <w:p>
       <w:pPr>
-        <w:ind w:left="720"/>
+        <w:spacing w:after="400"/>
+        <w:jc w:val="center"/>
       </w:pPr>
       <w:r>
         <w:rPr>
-          <w:rFonts w:ascii="Courier New" w:hAnsi="Courier New"/>
+          <w:i/>
+          <w:color w:val="718096"/>
+          <w:sz w:val="26"/>
+        </w:rPr>
+        <w:t>গুগল প্লে স্টোর পাবলিশিং সংক্রান্ত মেটাডেটা, অ্যান্টি-ব্যান পলিসি, ডাটা সেফটি ও সাবমিশন গাইড</w:t>
+      </w:r>
+    </w:p>
+    <w:tbl>
+      <w:tblPr>
+        <w:tblW w:type="auto" w:w="0"/>
+        <w:jc w:val="center"/>
+        <w:tblLook w:firstColumn="1" w:firstRow="1" w:lastColumn="0" w:lastRow="0" w:noHBand="0" w:noVBand="1" w:val="04A0"/>
+      </w:tblPr>
+      <w:tblGrid>
+        <w:gridCol w:w="9360"/>
+      </w:tblGrid>
+      <w:tr>
+        <w:tc>
+          <w:tcPr>
+            <w:tcW w:type="dxa" w:w="9360"/>
+            <w:shd w:fill="F0FDF4"/>
+          </w:tcPr>
+          <w:p>
+            <w:pPr>
+              <w:spacing w:before="120" w:after="120"/>
+              <w:ind w:left="144" w:right="144"/>
+            </w:pPr>
+            <w:r>
+              <w:rPr>
+                <w:b/>
+                <w:color w:val="0F5132"/>
+                <w:sz w:val="22"/>
+              </w:rPr>
+              <w:t>📌 গুরুত্বপূর্ণ তথ্য (App Identity):</w:t>
+              <w:br/>
+            </w:r>
+            <w:r>
+              <w:rPr>
+                <w:color w:val="2D3748"/>
+                <w:sz w:val="20"/>
+              </w:rPr>
+              <w:t>• অ্যাপের নাম (Official App Title): QuitMate</w:t>
+              <w:br/>
+              <w:t>• ডেভেলপারের সাপোর্ট ইমেল: ariful010a@gmail.com</w:t>
+              <w:br/>
+              <w:t>• লাইভ প্রাইভেসি পলিসি URL: https://ariful-islam010.github.io/tamak-privacy-policy/</w:t>
+              <w:br/>
+              <w:t>• ব্যাকএন্ড হোস্ট: Custom Express.js REST API &amp; PostgreSQL Database</w:t>
+            </w:r>
+          </w:p>
+        </w:tc>
+      </w:tr>
+    </w:tbl>
+    <w:p>
+      <w:pPr>
+        <w:spacing w:after="120"/>
+      </w:pPr>
+    </w:p>
+    <w:p>
+      <w:pPr>
+        <w:spacing w:before="360" w:after="160"/>
+      </w:pPr>
+      <w:r>
+        <w:rPr>
           <w:b/>
-          <w:i w:val="0"/>
-          <w:color w:val="006400"/>
-          <w:sz w:val="20"/>
+          <w:color w:val="0F5132"/>
+          <w:sz w:val="32"/>
         </w:rPr>
+        <w:t>১. গুগল প্লে স্টোর লিস্টিং মেটাডেটা (Main Store Listing)</w:t>
+      </w:r>
+    </w:p>
+    <w:p>
+      <w:pPr>
+        <w:spacing w:after="120" w:line="276" w:lineRule="auto"/>
+      </w:pPr>
+      <w:r>
+        <w:rPr>
+          <w:b/>
+          <w:color w:val="2D3748"/>
+          <w:sz w:val="21"/>
+        </w:rPr>
+        <w:t xml:space="preserve">1. App Title (অ্যান্ড্রয়েড অ্যাপের নাম - Max 30 chars): </w:t>
+      </w:r>
+      <w:r>
+        <w:rPr>
+          <w:color w:val="2D3748"/>
+          <w:sz w:val="21"/>
+        </w:rPr>
+        <w:t>QuitMate</w:t>
+      </w:r>
+    </w:p>
+    <w:p>
+      <w:pPr>
+        <w:spacing w:after="120" w:line="276" w:lineRule="auto"/>
+      </w:pPr>
+      <w:r>
+        <w:rPr>
+          <w:b/>
+          <w:color w:val="2D3748"/>
+          <w:sz w:val="21"/>
+        </w:rPr>
+        <w:t xml:space="preserve">2. Short Description (বাংলা - Max 80 chars): </w:t>
+      </w:r>
+      <w:r>
+        <w:rPr>
+          <w:color w:val="2D3748"/>
+          <w:sz w:val="21"/>
+        </w:rPr>
+        <w:t>ধূমপান ত্যাগের এআই কুইট প্ল্যান, ডেইলি ট্র্যাক, টাকা সেভার ও হেল্প সাপোর্ট। (৭৫ অক্ষর)</w:t>
+      </w:r>
+    </w:p>
+    <w:p>
+      <w:pPr>
+        <w:spacing w:after="120" w:line="276" w:lineRule="auto"/>
+      </w:pPr>
+      <w:r>
+        <w:rPr>
+          <w:b/>
+          <w:color w:val="2D3748"/>
+          <w:sz w:val="21"/>
+        </w:rPr>
+        <w:t xml:space="preserve">3. Short Description (English - Max 80 chars): </w:t>
+      </w:r>
+      <w:r>
+        <w:rPr>
+          <w:color w:val="2D3748"/>
+          <w:sz w:val="21"/>
+        </w:rPr>
+        <w:t>Quit smoking &amp; tobacco with AI plans, daily streak tracking, savings &amp; support. (76 chars)</w:t>
+      </w:r>
+    </w:p>
+    <w:p>
+      <w:pPr>
+        <w:spacing w:before="280" w:after="120"/>
+      </w:pPr>
+      <w:r>
+        <w:rPr>
+          <w:b/>
+          <w:color w:val="198754"/>
+          <w:sz w:val="26"/>
+        </w:rPr>
+        <w:t>4. Full Description (বিস্তারিত বিবরণ - Max 4000 chars)</w:t>
+      </w:r>
+    </w:p>
+    <w:p>
+      <w:pPr>
+        <w:spacing w:after="120" w:line="276" w:lineRule="auto"/>
+      </w:pPr>
+      <w:r>
+        <w:rPr>
+          <w:color w:val="2D3748"/>
+          <w:sz w:val="21"/>
+        </w:rPr>
+        <w:t>QuitMate - ধূমপান ও তামাক বর্জনের জন্য আপনার নির্ভরযোগ্য AI সহায়ক অ্যাপ!</w:t>
+        <w:br/>
+        <w:br/>
+        <w:t>আপনি কি ধূমপান বা তামাকের ক্ষতিকর অভ্যাস থেকে চিরতরে মুক্তি পেতে চান? আপনার ধূমপানমুক্ত স্বাস্থ্যকর জীবনের যাত্রাকে সহজ, বিজ্ঞানসম্মত এবং অনুপ্রেরণাদায়ী করতে এসেছে QuitMate!</w:t>
+        <w:br/>
+        <w:br/>
+        <w:t>QuitMate অ্যাপটি আপনাকে প্রতিদিনের নির্দিষ্ট লক্ষ্যমাত্রা, AI কুইট প্ল্যান, ক্রেভিং কন্ট্রোল এবং সাশ্রয়কৃত অর্থের হিসাব দিয়ে আপনার তামাকমুক্ত জীবন গঠনে সরাসরি সাহায্য করবে।</w:t>
+        <w:br/>
+        <w:br/>
+        <w:t>🌟 মূল ফিচারসমূহ (Key Features):</w:t>
+        <w:br/>
+        <w:br/>
+        <w:t>• AI কুইট প্ল্যান (AI Quit Plan):</w:t>
+        <w:br/>
+        <w:t>আপনার তামাক ব্যবহারের ধরন, বয়স এবং অভ্যাসের ওপর ভিত্তি করে কাস্টমাইজড এআই কুইট প্ল্যান পান। প্রতিদিনের ছোট ছোট মাইলস্টোন সম্পন্ন করে ধূমপান ত্যাগের লক্ষ্য অর্জনে এগিয়ে যান।</w:t>
+        <w:br/>
+        <w:br/>
+        <w:t>• দৈনিক চেক-ইন ও ক্রেভিং ট্র্যাকার (Daily Check-in):</w:t>
+        <w:br/>
+        <w:t>প্রতিদিন আপনার শারীরিক অবস্থা, মুড এবং ক্রেভিং (ধূমপানের তীব্র ইচ্ছে) রেকর্ড করুন। আপনার ধারাবাহিকতা বজায় রাখতে স্ট্রাইক কাউন্টার (Streak Counter) দেখুন।</w:t>
+        <w:br/>
+        <w:br/>
+        <w:t>• টাকা সেভার ও ড্রীম ট্র্যাকার (Money Saver):</w:t>
+        <w:br/>
+        <w:t>ধূমপান না করে প্রতিদিন কত টাকা বাঁচালেন তার রিয়েল-টাইম হিসাব দেখুন। আপনার সাশ্রয়কৃত টাকা দিয়ে কী কী স্বপ্ন বা ইচ্ছে পূরণ করতে চান তার উইশলিস্ট তৈরি করুন।</w:t>
+        <w:br/>
+        <w:br/>
+        <w:t>• এস.ও.এস ইমার্জেন্সি সাপোর্ট (SOS Craving Button):</w:t>
+        <w:br/>
+        <w:t>হঠাৎ ধূমপানের তীব্র ইচ্ছে জাগলে এসওএস বাটন চাপুন। গভীর শ্বাস-প্রশ্বাসের ব্যায়াম, পানি পানের নির্দেশিকা ও মন শান্ত করার ইনস্ট্যান্ট টিপস পান।</w:t>
+        <w:br/>
+        <w:br/>
+        <w:t>• পিয়ার সাপোর্ট গ্রুপ (Peer Support Community):</w:t>
+        <w:br/>
+        <w:t>সহায়ক চ্যাট গ্রুপে অন্যান্য বন্ধুদের সাথে অভিজ্ঞতা ও অনুপ্রেরণা শেয়ার করুন। সহমর্মী কম্যুনিটির সাথে যুক্ত থেকে নিজের লক্ষ্য শক্ত রাখুন।</w:t>
+        <w:br/>
+        <w:br/>
+        <w:t>• শিক্ষণীয় স্বাস্থ্য তথ্য (Health Awareness):</w:t>
+        <w:br/>
+        <w:t>ধূমপান ত্যাগের পর আপনার ফুসফুস, হৃদযন্ত্র ও রক্ত সঞ্চালনের উন্নতি সম্পর্কিত বৈজ্ঞানিক তথ্য ও নোটিফিকেশন পান।</w:t>
+        <w:br/>
+        <w:br/>
+        <w:t>🛡️ প্রাইভেসি ও ডেটা নিরাপত্তা:</w:t>
+        <w:br/>
+        <w:t>আপনার সমস্ত তথ্য এবং প্রোগ্রেস ইতিহাস আমাদের ডেডিকেটেড রিমোট ব্যাকএন্ড সার্ভারে (HTTPS SSL Encryption) সম্পূর্ণ নিরাপদ ও এনক্রিপ্ট অবস্থায় সংরক্ষিত থাকে।</w:t>
+        <w:br/>
+        <w:br/>
+        <w:t>⚠️ গুরুত্বপূর্ণ মেডিকেল ডিসক্লেইমার (Medical Disclaimer):</w:t>
+        <w:br/>
+        <w:t>QuitMate অ্যাপটি ধূমপান ও তামাক ত্যাগে উৎসাহিত করার জন্য একটি প্রোগ্রেস ট্র্যাকিং ও অনুপ্রেরণামূলক টুল। এই অ্যাপে প্রদর্শিত তথ্য বা এআই নির্দেশনা কোনো চিকিৎসকের পেশাদার পরামর্শ বা চিকিৎসার বিকল্প নয়। স্বাস্থ্য সংক্রান্ত জরুরি প্রয়োজনে একজন লাইসেন্সপ্রাপ্ত ডাক্তারের পরামর্শ নিন।</w:t>
+        <w:br/>
+        <w:br/>
+        <w:t>📩 ডেভলপার সাপোর্ট ও প্রশ্ন:</w:t>
+        <w:br/>
+        <w:t>ইমেইল: ariful010a@gmail.com</w:t>
+        <w:br/>
+        <w:t>আজই QuitMate ডাউনলোড করুন এবং ধূমপানমুক্ত সুস্থ ও সুন্দর জীবনের পথচলা শুরু করুন!</w:t>
+      </w:r>
+    </w:p>
+    <w:p>
+      <w:pPr>
+        <w:spacing w:before="280" w:after="120"/>
+      </w:pPr>
+      <w:r>
+        <w:rPr>
+          <w:b/>
+          <w:color w:val="198754"/>
+          <w:sz w:val="26"/>
+        </w:rPr>
+        <w:t>5. Category, Tags &amp; Graphics Assets</w:t>
+      </w:r>
+    </w:p>
+    <w:p>
+      <w:pPr>
+        <w:spacing w:after="120" w:line="276" w:lineRule="auto"/>
+      </w:pPr>
+      <w:r>
+        <w:rPr>
+          <w:b/>
+          <w:color w:val="2D3748"/>
+          <w:sz w:val="21"/>
+        </w:rPr>
+        <w:t xml:space="preserve">• Application Category: </w:t>
+      </w:r>
+      <w:r>
+        <w:rPr>
+          <w:color w:val="2D3748"/>
+          <w:sz w:val="21"/>
+        </w:rPr>
+        <w:t>Health &amp; Fitness (HEALTH_AND_FITNESS)</w:t>
+      </w:r>
+    </w:p>
+    <w:p>
+      <w:pPr>
+        <w:spacing w:after="120" w:line="276" w:lineRule="auto"/>
+      </w:pPr>
+      <w:r>
+        <w:rPr>
+          <w:b/>
+          <w:color w:val="2D3748"/>
+          <w:sz w:val="21"/>
+        </w:rPr>
+        <w:t xml:space="preserve">• Tags / Keywords: </w:t>
+      </w:r>
+      <w:r>
+        <w:rPr>
+          <w:color w:val="2D3748"/>
+          <w:sz w:val="21"/>
+        </w:rPr>
+        <w:t>quit smoking, tobacco awareness, smoke free, anti smoking, tobacco tracker, smoking cessation</w:t>
+      </w:r>
+    </w:p>
+    <w:p>
+      <w:pPr>
+        <w:spacing w:after="120" w:line="276" w:lineRule="auto"/>
+      </w:pPr>
+      <w:r>
+        <w:rPr>
+          <w:b/>
+          <w:color w:val="2D3748"/>
+          <w:sz w:val="21"/>
+        </w:rPr>
+        <w:t xml:space="preserve">• App Icon Asset: </w:t>
+      </w:r>
+      <w:r>
+        <w:rPr>
+          <w:color w:val="2D3748"/>
+          <w:sz w:val="21"/>
+        </w:rPr>
+        <w:t>app_publishing_pack/assets/app_icon.png (512x512 PNG)</w:t>
+      </w:r>
+    </w:p>
+    <w:p>
+      <w:pPr>
+        <w:spacing w:after="120" w:line="276" w:lineRule="auto"/>
+      </w:pPr>
+      <w:r>
+        <w:rPr>
+          <w:b/>
+          <w:color w:val="2D3748"/>
+          <w:sz w:val="21"/>
+        </w:rPr>
+        <w:t xml:space="preserve">• Feature Graphic Asset: </w:t>
+      </w:r>
+      <w:r>
+        <w:rPr>
+          <w:color w:val="2D3748"/>
+          <w:sz w:val="21"/>
+        </w:rPr>
+        <w:t>app_publishing_pack/assets/feature_graphic.png (1024x500 PNG)</w:t>
+      </w:r>
+    </w:p>
+    <w:p>
+      <w:pPr>
+        <w:spacing w:before="360" w:after="160"/>
+      </w:pPr>
+      <w:r>
+        <w:rPr>
+          <w:b/>
+          <w:color w:val="0F5132"/>
+          <w:sz w:val="32"/>
+        </w:rPr>
+        <w:t>২. অ্যান্টি-ব্যান ও প্লে স্টোর পলিসি গাইড (Anti-Ban Guidelines)</w:t>
+      </w:r>
+    </w:p>
+    <w:tbl>
+      <w:tblPr>
+        <w:tblW w:type="auto" w:w="0"/>
+        <w:jc w:val="center"/>
+        <w:tblLook w:firstColumn="1" w:firstRow="1" w:lastColumn="0" w:lastRow="0" w:noHBand="0" w:noVBand="1" w:val="04A0"/>
+      </w:tblPr>
+      <w:tblGrid>
+        <w:gridCol w:w="9360"/>
+      </w:tblGrid>
+      <w:tr>
+        <w:tc>
+          <w:tcPr>
+            <w:tcW w:type="dxa" w:w="9360"/>
+            <w:shd w:fill="FFFBEB"/>
+          </w:tcPr>
+          <w:p>
+            <w:pPr>
+              <w:spacing w:before="120" w:after="120"/>
+              <w:ind w:left="144" w:right="144"/>
+            </w:pPr>
+            <w:r>
+              <w:rPr>
+                <w:b/>
+                <w:color w:val="D97706"/>
+                <w:sz w:val="22"/>
+              </w:rPr>
+              <w:t>⚠️ প্লে স্টোর টোব্যাকো ও ই-সিগারেট পলিসি সতর্কতা:</w:t>
+              <w:br/>
+            </w:r>
+            <w:r>
+              <w:rPr>
+                <w:color w:val="2D3748"/>
+                <w:sz w:val="20"/>
+              </w:rPr>
+              <w:t>১. কোনোভাবেই ধূমপানকে ইতিবাচক বা আকর্ষণীয় করে উপস্থাপন করা যাবে না। অ্যাপটি ১০০% 'ধূমপান ও তামাক ত্যাগের সহায়িকা' হিসেবে প্লে স্টোরে প্রচার করতে হবে।</w:t>
+              <w:br/>
+              <w:t>২. প্রমোশনাল আইকন বা গ্রাফিক্সে আসল সিগারেটের ব্র্যান্ড লোগো বা ধূমপানরত ব্যক্তির ছবি ব্যবহার করবেন না।</w:t>
+              <w:br/>
+              <w:t>৩. নিষিদ্ধ কীওয়ার্ড (যেমন: Buy Vape, Cigarette Flavors) এড়িয়ে চলতে হবে।</w:t>
+            </w:r>
+          </w:p>
+        </w:tc>
+      </w:tr>
+    </w:tbl>
+    <w:p>
+      <w:pPr>
+        <w:spacing w:after="120"/>
+      </w:pPr>
+    </w:p>
+    <w:p>
+      <w:pPr>
+        <w:spacing w:after="120" w:line="276" w:lineRule="auto"/>
+      </w:pPr>
+      <w:r>
+        <w:rPr>
+          <w:b/>
+          <w:color w:val="2D3748"/>
+          <w:sz w:val="21"/>
+        </w:rPr>
+        <w:t xml:space="preserve">• মেডিকেল ডিসক্লেইমার পলিসি: </w:t>
+      </w:r>
+      <w:r>
+        <w:rPr>
+          <w:color w:val="2D3748"/>
+          <w:sz w:val="21"/>
+        </w:rPr>
+        <w:t>হেলথ অ্যাপের ক্ষেত্রে বাধ্যতামূলকভাবে অ্যাপের ভেতর (Help screen) এবং প্রাইভেসিতে মেডিকেল ডিসক্লেইমার দেওয়া আবশ্যক যা আপনার প্রজেক্টে যুক্ত করা হয়েছে।</w:t>
+      </w:r>
+    </w:p>
+    <w:p>
+      <w:pPr>
+        <w:spacing w:after="120" w:line="276" w:lineRule="auto"/>
+      </w:pPr>
+      <w:r>
+        <w:rPr>
+          <w:b/>
+          <w:color w:val="2D3748"/>
+          <w:sz w:val="21"/>
+        </w:rPr>
+        <w:t xml:space="preserve">• ইউজার জেনারেটেড কন্টেন্ট (UGC) পলিসি: </w:t>
+      </w:r>
+      <w:r>
+        <w:rPr>
+          <w:color w:val="2D3748"/>
+          <w:sz w:val="21"/>
+        </w:rPr>
+        <w:t>সাপোর্ট চ্যাট গ্রপে কম্যুনিটি গাইডলাইন এবং অনাকাঙ্ক্ষিত মেসেজ বা ইউজারকে রিপোর্ট (ariful010a@gmail.com) করার অপশন চালু করা হয়েছে।</w:t>
+      </w:r>
+    </w:p>
+    <w:p>
+      <w:pPr>
+        <w:spacing w:after="120" w:line="276" w:lineRule="auto"/>
+      </w:pPr>
+      <w:r>
+        <w:rPr>
+          <w:b/>
+          <w:color w:val="2D3748"/>
+          <w:sz w:val="21"/>
+        </w:rPr>
+        <w:t xml:space="preserve">• বয়সসীমা ও টার্গেট অডিয়েন্স: </w:t>
+      </w:r>
+      <w:r>
+        <w:rPr>
+          <w:color w:val="2D3748"/>
+          <w:sz w:val="21"/>
+        </w:rPr>
+        <w:t>টার্গেট অডিয়েন্স ১৩+ / ১৮+ নির্বাচন করুন এবং 'Is designed for children' প্রশ্নের জবাবে NO নির্বাচন করুন।</w:t>
+      </w:r>
+    </w:p>
+    <w:p>
+      <w:pPr>
+        <w:spacing w:before="360" w:after="160"/>
+      </w:pPr>
+      <w:r>
+        <w:rPr>
+          <w:b/>
+          <w:color w:val="0F5132"/>
+          <w:sz w:val="32"/>
+        </w:rPr>
+        <w:t>৩. প্রাইভেসি পলিসি ও ডেটা ডিলিট নির্দেশিকা</w:t>
+      </w:r>
+    </w:p>
+    <w:p>
+      <w:pPr>
+        <w:spacing w:after="120" w:line="276" w:lineRule="auto"/>
+      </w:pPr>
+      <w:r>
+        <w:rPr>
+          <w:b/>
+          <w:color w:val="2D3748"/>
+          <w:sz w:val="21"/>
+        </w:rPr>
+        <w:t xml:space="preserve">• লাইভ হোস্টেড প্রাইভেসি পলিসি URL: </w:t>
+      </w:r>
+      <w:r>
+        <w:rPr>
+          <w:color w:val="2D3748"/>
+          <w:sz w:val="21"/>
+        </w:rPr>
+        <w:t>https://ariful-islam010.github.io/tamak-privacy-policy/</w:t>
+      </w:r>
+    </w:p>
+    <w:p>
+      <w:pPr>
+        <w:spacing w:after="120" w:line="276" w:lineRule="auto"/>
+      </w:pPr>
+      <w:r>
+        <w:rPr>
+          <w:b/>
+          <w:color w:val="2D3748"/>
+          <w:sz w:val="21"/>
+        </w:rPr>
+        <w:t xml:space="preserve">• ডেটা ডিলিট পলিসি: </w:t>
+      </w:r>
+      <w:r>
+        <w:rPr>
+          <w:color w:val="2D3748"/>
+          <w:sz w:val="21"/>
+        </w:rPr>
+        <w:t>প্লে স্টোর নীতি অনুযায়ী অ্যাপের প্রাইভেসিতে স্পষ্ট বলা আছে যে ব্যবহারকারী ariful010a@gmail.com এ 'Account Deletion Request' পাঠালে ৪৮ ঘণ্টার মধ্যে তার সমস্ত তথ্য ব্যাকএন্ড পোস্টগ্রি-এসকিউএল ডাটাবেস থেকে মুছে ফেলা হবে।</w:t>
+      </w:r>
+    </w:p>
+    <w:p>
+      <w:pPr>
+        <w:spacing w:before="360" w:after="160"/>
+      </w:pPr>
+      <w:r>
+        <w:rPr>
+          <w:b/>
+          <w:color w:val="0F5132"/>
+          <w:sz w:val="32"/>
+        </w:rPr>
+        <w:t>৪. গুগল প্লে ডাটা সেফটি (Data Safety Form) উত্তরপত্র</w:t>
+      </w:r>
+    </w:p>
+    <w:p>
+      <w:pPr>
+        <w:spacing w:after="120" w:line="276" w:lineRule="auto"/>
+      </w:pPr>
+      <w:r>
+        <w:rPr>
+          <w:b/>
+          <w:color w:val="2D3748"/>
+          <w:sz w:val="21"/>
+        </w:rPr>
+        <w:t xml:space="preserve">• Does your app collect or share user data? </w:t>
+      </w:r>
+      <w:r>
+        <w:rPr>
+          <w:color w:val="2D3748"/>
+          <w:sz w:val="21"/>
+        </w:rPr>
+        <w:t>Yes</w:t>
+      </w:r>
+    </w:p>
+    <w:p>
+      <w:pPr>
+        <w:spacing w:after="120" w:line="276" w:lineRule="auto"/>
+      </w:pPr>
+      <w:r>
+        <w:rPr>
+          <w:b/>
+          <w:color w:val="2D3748"/>
+          <w:sz w:val="21"/>
+        </w:rPr>
+        <w:t xml:space="preserve">• Is all data encrypted in transit? </w:t>
+      </w:r>
+      <w:r>
+        <w:rPr>
+          <w:color w:val="2D3748"/>
+          <w:sz w:val="21"/>
+        </w:rPr>
+        <w:t>Yes (All requests use HTTPS / SSL to our dedicated backend server)</w:t>
+      </w:r>
+    </w:p>
+    <w:p>
+      <w:pPr>
+        <w:spacing w:after="120" w:line="276" w:lineRule="auto"/>
+      </w:pPr>
+      <w:r>
+        <w:rPr>
+          <w:b/>
+          <w:color w:val="2D3748"/>
+          <w:sz w:val="21"/>
+        </w:rPr>
+        <w:t xml:space="preserve">• Do you provide a way for users to request data deletion? </w:t>
+      </w:r>
+      <w:r>
+        <w:rPr>
+          <w:color w:val="2D3748"/>
+          <w:sz w:val="21"/>
+        </w:rPr>
+        <w:t>Yes (In-app request &amp; email support: ariful010a@gmail.com)</w:t>
+      </w:r>
+    </w:p>
+    <w:p>
+      <w:pPr>
+        <w:spacing w:after="120" w:line="276" w:lineRule="auto"/>
+      </w:pPr>
+      <w:r>
+        <w:rPr>
+          <w:b/>
+          <w:color w:val="2D3748"/>
+          <w:sz w:val="21"/>
+        </w:rPr>
+        <w:t xml:space="preserve">• Data Types Collected: </w:t>
+      </w:r>
+      <w:r>
+        <w:rPr>
+          <w:color w:val="2D3748"/>
+          <w:sz w:val="21"/>
+        </w:rPr>
+        <w:t>Personal Info (Name, Email), Health Info (Cravings, Quit date), Financial (Money saved count), Messages (Peer chat).</w:t>
+      </w:r>
+    </w:p>
+    <w:p>
+      <w:pPr>
+        <w:spacing w:after="120" w:line="276" w:lineRule="auto"/>
+      </w:pPr>
+      <w:r>
+        <w:rPr>
+          <w:b/>
+          <w:color w:val="2D3748"/>
+          <w:sz w:val="21"/>
+        </w:rPr>
+        <w:t xml:space="preserve">• Data Sharing with Third Parties: </w:t>
+      </w:r>
+      <w:r>
+        <w:rPr>
+          <w:color w:val="2D3748"/>
+          <w:sz w:val="21"/>
+        </w:rPr>
+        <w:t>No (We do not sell or share data with third party advertisers).</w:t>
+      </w:r>
+    </w:p>
+    <w:p>
+      <w:pPr>
+        <w:spacing w:before="360" w:after="160"/>
+      </w:pPr>
+      <w:r>
+        <w:rPr>
+          <w:b/>
+          <w:color w:val="0F5132"/>
+          <w:sz w:val="32"/>
+        </w:rPr>
+        <w:t>৫. প্লে কস্মোল কন্টেন্ট ও আইএআরসি (IARC) ফর্ম উত্তরপত্র</w:t>
+      </w:r>
+    </w:p>
+    <w:p>
+      <w:pPr>
+        <w:spacing w:after="120" w:line="276" w:lineRule="auto"/>
+      </w:pPr>
+      <w:r>
+        <w:rPr>
+          <w:b/>
+          <w:color w:val="2D3748"/>
+          <w:sz w:val="21"/>
+        </w:rPr>
+        <w:t xml:space="preserve">• Does the app promote, sell, or facilitate the sale of tobacco products? </w:t>
+      </w:r>
+      <w:r>
+        <w:rPr>
+          <w:color w:val="2D3748"/>
+          <w:sz w:val="21"/>
+        </w:rPr>
+        <w:t>No</w:t>
+      </w:r>
+    </w:p>
+    <w:p>
+      <w:pPr>
+        <w:spacing w:after="120" w:line="276" w:lineRule="auto"/>
+      </w:pPr>
+      <w:r>
+        <w:rPr>
+          <w:b/>
+          <w:color w:val="2D3748"/>
+          <w:sz w:val="21"/>
+        </w:rPr>
+        <w:t xml:space="preserve">• Does the app contain references to tobacco? </w:t>
+      </w:r>
+      <w:r>
+        <w:rPr>
+          <w:color w:val="2D3748"/>
+          <w:sz w:val="21"/>
+        </w:rPr>
+        <w:t>Yes (Educational and motivational cessation tools)</w:t>
+      </w:r>
+    </w:p>
+    <w:p>
+      <w:pPr>
+        <w:spacing w:after="120" w:line="276" w:lineRule="auto"/>
+      </w:pPr>
+      <w:r>
+        <w:rPr>
+          <w:b/>
+          <w:color w:val="2D3748"/>
+          <w:sz w:val="21"/>
+        </w:rPr>
+        <w:t xml:space="preserve">• Financial Services Declaration: </w:t>
+      </w:r>
+      <w:r>
+        <w:rPr>
+          <w:color w:val="2D3748"/>
+          <w:sz w:val="21"/>
+        </w:rPr>
+        <w:t>No (Money Saver is a personal savings counter, not a financial transaction service)</w:t>
+      </w:r>
+    </w:p>
+    <w:p>
+      <w:pPr>
+        <w:spacing w:after="120" w:line="276" w:lineRule="auto"/>
+      </w:pPr>
+      <w:r>
+        <w:rPr>
+          <w:b/>
+          <w:color w:val="2D3748"/>
+          <w:sz w:val="21"/>
+        </w:rPr>
+        <w:t xml:space="preserve">• Health App Declaration: </w:t>
+      </w:r>
+      <w:r>
+        <w:rPr>
+          <w:color w:val="2D3748"/>
+          <w:sz w:val="21"/>
+        </w:rPr>
+        <w:t>Health &amp; Fitness / Wellness tracking (Non-regulated medical app)</w:t>
+      </w:r>
+    </w:p>
+    <w:p>
+      <w:pPr>
+        <w:spacing w:before="360" w:after="160"/>
+      </w:pPr>
+      <w:r>
+        <w:rPr>
+          <w:b/>
+          <w:color w:val="0F5132"/>
+          <w:sz w:val="32"/>
+        </w:rPr>
+        <w:t>৬. অ্যান্ডয়েড রিলিজ বান্ডেল (AAB) ও প্লে স্টোর আপলোড ধাপ</w:t>
+      </w:r>
+    </w:p>
+    <w:p>
+      <w:pPr>
+        <w:spacing w:after="120" w:line="276" w:lineRule="auto"/>
+      </w:pPr>
+      <w:r>
+        <w:rPr>
+          <w:b/>
+          <w:color w:val="2D3748"/>
+          <w:sz w:val="21"/>
+        </w:rPr>
+        <w:t xml:space="preserve">Step 1: Release Keystore তৈরি: </w:t>
+      </w:r>
+      <w:r>
+        <w:rPr>
+          <w:color w:val="2D3748"/>
+          <w:sz w:val="21"/>
+        </w:rPr>
+        <w:t>android/app/ ফোল্ডারে টার্মিনালে রান করুন:</w:t>
+        <w:br/>
+        <w:t>keytool -genkey -v -keystore upload-keystore.jks -storetype JKS -keyalg RSA -keysize 2048 -validity 10000 -alias upload</w:t>
+      </w:r>
+    </w:p>
+    <w:p>
+      <w:pPr>
+        <w:spacing w:after="120" w:line="276" w:lineRule="auto"/>
+      </w:pPr>
+      <w:r>
+        <w:rPr>
+          <w:b/>
+          <w:color w:val="2D3748"/>
+          <w:sz w:val="21"/>
+        </w:rPr>
+        <w:t xml:space="preserve">Step 2: Key Properties কনফিগারেশন: </w:t>
+      </w:r>
+      <w:r>
+        <w:rPr>
+          <w:color w:val="2D3748"/>
+          <w:sz w:val="21"/>
+        </w:rPr>
+        <w:t>android/key.properties ফাইল তৈরি করে পাসওয়ার্ড ও অ্যালিয়াস যুক্ত করুন।</w:t>
+      </w:r>
+    </w:p>
+    <w:p>
+      <w:pPr>
+        <w:spacing w:after="120" w:line="276" w:lineRule="auto"/>
+      </w:pPr>
+      <w:r>
+        <w:rPr>
+          <w:b/>
+          <w:color w:val="2D3748"/>
+          <w:sz w:val="21"/>
+        </w:rPr>
+        <w:t xml:space="preserve">Step 3: AAB বান্ডেল বিল্ড: </w:t>
+      </w:r>
+      <w:r>
+        <w:rPr>
+          <w:color w:val="2D3748"/>
+          <w:sz w:val="21"/>
+        </w:rPr>
+        <w:t>প্রজেক্ট রুট ফোল্ডারে (cd tobacco_awareness) টার্মিনালে রান করুন:</w:t>
+        <w:br/>
         <w:t>flutter build appbundle --release</w:t>
       </w:r>
     </w:p>
     <w:p>
-      <w:r>
-        <w:t>সফলভাবে বিল্ড হওয়ার পর রিলিজ ফাইলটি এখানে পাবেন:</w:t>
-      </w:r>
-    </w:p>
-    <w:p>
       <w:pPr>
-        <w:ind w:left="720"/>
+        <w:spacing w:after="120" w:line="276" w:lineRule="auto"/>
       </w:pPr>
       <w:r>
         <w:rPr>
-          <w:rFonts w:ascii="Courier New" w:hAnsi="Courier New"/>
           <w:b/>
-          <w:i w:val="0"/>
-          <w:sz w:val="20"/>
+          <w:color w:val="2D3748"/>
+          <w:sz w:val="21"/>
         </w:rPr>
-        <w:t>build/app/outputs/bundle/release/app-release.aab</w:t>
+        <w:t xml:space="preserve">Step 4: Play Console Upload: </w:t>
+      </w:r>
+      <w:r>
+        <w:rPr>
+          <w:color w:val="2D3748"/>
+          <w:sz w:val="21"/>
+        </w:rPr>
+        <w:t>বিল্ড হওয়া AAB ফাইলটি (build/app/outputs/bundle/release/app-release.aab) প্লে কস্মোলে আপলোড করুন।</w:t>
       </w:r>
     </w:p>
+    <w:tbl>
+      <w:tblPr>
+        <w:tblW w:type="auto" w:w="0"/>
+        <w:jc w:val="center"/>
+        <w:tblLook w:firstColumn="1" w:firstRow="1" w:lastColumn="0" w:lastRow="0" w:noHBand="0" w:noVBand="1" w:val="04A0"/>
+      </w:tblPr>
+      <w:tblGrid>
+        <w:gridCol w:w="9360"/>
+      </w:tblGrid>
+      <w:tr>
+        <w:tc>
+          <w:tcPr>
+            <w:tcW w:type="dxa" w:w="9360"/>
+            <w:shd w:fill="F0FDF4"/>
+          </w:tcPr>
+          <w:p>
+            <w:pPr>
+              <w:spacing w:before="120" w:after="120"/>
+              <w:ind w:left="144" w:right="144"/>
+            </w:pPr>
+            <w:r>
+              <w:rPr>
+                <w:b/>
+                <w:color w:val="0F5132"/>
+                <w:sz w:val="22"/>
+              </w:rPr>
+              <w:t>🔥 অত্যন্ত গুরুত্বপূর্ণ - Google Auth SHA-1 সেটআপ:</w:t>
+              <w:br/>
+            </w:r>
+            <w:r>
+              <w:rPr>
+                <w:color w:val="2D3748"/>
+                <w:sz w:val="20"/>
+              </w:rPr>
+              <w:t>অ্যাপ প্লে স্টোরে আপলোড করার পর Play Console -&gt; Setup -&gt; App integrity -&gt; App signing থেকে SHA-1 ফিঙ্গারপ্রিন্ট কপি করে Firebase Console-এ যোগ করুন এবং নতুন google-services.json আপলোড করুন। এটি না করলে গুগল সাইন-ইন রিলিজ বান্ডেলে ব্যর্থ হবে।</w:t>
+            </w:r>
+          </w:p>
+        </w:tc>
+      </w:tr>
+    </w:tbl>
     <w:p>
-      <w:r>
-        <w:rPr>
-          <w:rFonts w:ascii="Calibri" w:hAnsi="Calibri"/>
-          <w:b/>
-          <w:i w:val="0"/>
-          <w:color w:val="2E7D32"/>
-          <w:sz w:val="26"/>
-        </w:rPr>
-        <w:t>৩. গুগল প্লে স্টোরে পাবলিশ করার ধাপসমূহ</w:t>
-      </w:r>
-    </w:p>
-    <w:p>
-      <w:r>
-        <w:t>১. গুগল প্লে কনসোল অ্যাকাউন্ট: প্রথমে Google Play Console-এ গিয়ে আপনার ২৫ ডলার মূল্যের ডেভেলপার অ্যাকাউন্টটি তৈরি করুন।</w:t>
-      </w:r>
-    </w:p>
-    <w:p>
-      <w:r>
-        <w:t>২. অ্যাপ তৈরি করুন (Create App): প্লে কনসোলে গিয়ে 'Create App' এ ক্লিক করুন। অ্যাপের নাম দিন 'তামাকমুক্ত জীবন', ডিফল্ট ভাষা 'Bengali' সিলেক্ট করুন এবং টাইপ হিসেবে 'App' সিলেক্ট করুন।</w:t>
-      </w:r>
-    </w:p>
-    <w:p>
-      <w:r>
-        <w:t>৩. স্টোর লিস্টিং (Store Listing): 'Store presence' -&gt; 'Main store listing'-এ গিয়ে metadata/play_store_metadata.docx ফাইল থেকে টাইটেল, শর্ট ডেসক্রিপশন এবং ফুল ডেসক্রিপশন কপি করে পেস্ট করুন।</w:t>
-      </w:r>
-    </w:p>
-    <w:p>
-      <w:r>
-        <w:t>৪. গ্রাফিক্স আপলোড (Graphics Assets): একই পেজে assets/app_icon.png ফাইলটি App Icon হিসেবে এবং assets/feature_graphic.png ফাইলটি Feature Graphic হিসেবে আপলোড করুন। এছাড়া আপনার ফোনের ৪-৮টি স্ক্রিনশট আপলোড করুন (স্ক্রিনশট সহজে নেওয়ার জন্য app_publishing_pack ফোল্ডারে থাকা take_screenshot.ps1 স্ক্রিপ্টটি রান করতে পারেন)।</w:t>
-      </w:r>
-    </w:p>
-    <w:p>
-      <w:r>
-        <w:t>৫. প্রাইভেসি পলিসি (Privacy Policy): আমরা আপনার অ্যাপের প্রাইভেসি পলিসিটি ইতিমধ্যে গিটহাবে হোস্ট করে দিয়েছি! সরাসরি নিচের লিংকটি কপি করে প্লে কনসোলে বসিয়ে দিন:</w:t>
-        <w:br/>
-        <w:t>https://ariful-islam010.github.io/tamak-privacy-policy/</w:t>
-      </w:r>
-    </w:p>
-    <w:p>
-      <w:r>
-        <w:t>৬. অ্যাপ বান্ডেল আপলোড (Production Release): 'Release' -&gt; 'Production'-এ গিয়ে একটি নতুন রিলিজ তৈরি করুন এবং আপনার পিসি থেকে পূর্বে তৈরি করা app-release.aab ফাইলটি আপলোড করুন।</w:t>
-      </w:r>
-    </w:p>
-    <w:p>
-      <w:r>
-        <w:t>৭. রিভিউ সাবমিট: কনসোলের সমস্ত ড্যাশবোর্ড টাস্ক এবং কনটেন্ট রেটিং ফর্মগুলো সম্পন্ন করে 'Start rollout to production' বাটনে ক্লিক করে রিভিউয়ের জন্য পাঠান। গুগলের টিম পরীক্ষা করে ২-৪ দিনের মধ্যে অ্যাপটি লাইভ করে দেবে।</w:t>
-      </w:r>
+      <w:pPr>
+        <w:spacing w:after="120"/>
+      </w:pPr>
     </w:p>
     <w:sectPr>
       <w:pgSz w:w="12240" w:h="15840"/>
-      <w:pgMar w:top="1440" w:right="1800" w:bottom="1440" w:left="1800" w:header="720" w:footer="720" w:gutter="0"/>
+      <w:pgMar w:top="1440" w:right="1440" w:bottom="1440" w:left="1440" w:header="720" w:footer="720" w:gutter="0"/>
       <w:cols w:space="720"/>
       <w:docGrid w:linePitch="360"/>
     </w:sectPr>

</xml_diff>